<commit_message>
Improve description timeout behaviour
</commit_message>
<xml_diff>
--- a/Documents/Webapp/Webapp_modules_description.docx
+++ b/Documents/Webapp/Webapp_modules_description.docx
@@ -2721,13 +2721,7 @@
         <w:ind w:left="567" w:hanging="357"/>
       </w:pPr>
       <w:r>
-        <w:t>Message listener thread</w:t>
-      </w:r>
-      <w:r>
-        <w:t xml:space="preserve"> with </w:t>
-      </w:r>
-      <w:r>
-        <w:t>Threading Model:</w:t>
+        <w:t>Message listener thread with Threading Model:</w:t>
       </w:r>
     </w:p>
     <w:p>
@@ -3044,6 +3038,20 @@
       </w:pPr>
       <w:r>
         <w:t>address=/#/&lt;ACCESS_POINT_HOST&gt;</w:t>
+      </w:r>
+    </w:p>
+    <w:p>
+      <w:pPr>
+        <w:pStyle w:val="Lijstalinea"/>
+        <w:numPr>
+          <w:ilvl w:val="0"/>
+          <w:numId w:val="50"/>
+        </w:numPr>
+        <w:spacing w:after="60"/>
+        <w:ind w:left="567" w:hanging="357"/>
+      </w:pPr>
+      <w:r>
+        <w:t>Reset timeout timer flag to inactive</w:t>
       </w:r>
     </w:p>
     <w:p>
@@ -3581,6 +3589,7 @@
       </w:pPr>
       <w:bookmarkStart w:id="12" w:name="_Toc223076448"/>
       <w:r>
+        <w:lastRenderedPageBreak/>
         <w:t>Design &amp; Threading</w:t>
       </w:r>
       <w:bookmarkEnd w:id="12"/>
@@ -3605,7 +3614,6 @@
       </w:pPr>
       <w:proofErr w:type="spellStart"/>
       <w:r>
-        <w:lastRenderedPageBreak/>
         <w:t>threading.Thread</w:t>
       </w:r>
       <w:proofErr w:type="spellEnd"/>
@@ -4273,6 +4281,7 @@
         <w:ind w:left="567" w:hanging="357"/>
       </w:pPr>
       <w:r>
+        <w:lastRenderedPageBreak/>
         <w:t>Static file serving</w:t>
       </w:r>
     </w:p>
@@ -4297,7 +4306,6 @@
       </w:pPr>
       <w:bookmarkStart w:id="18" w:name="_Toc223076454"/>
       <w:r>
-        <w:lastRenderedPageBreak/>
         <w:t>Architecture</w:t>
       </w:r>
       <w:bookmarkEnd w:id="18"/>
@@ -4961,6 +4969,7 @@
         <w:ind w:left="567" w:hanging="357"/>
       </w:pPr>
       <w:r>
+        <w:lastRenderedPageBreak/>
         <w:t>MPD playlists</w:t>
       </w:r>
     </w:p>
@@ -4997,7 +5006,6 @@
         <w:spacing w:after="60"/>
       </w:pPr>
       <w:r>
-        <w:lastRenderedPageBreak/>
         <w:t>State messages sent to controller when:</w:t>
       </w:r>
     </w:p>
@@ -5496,6 +5504,7 @@
         <w:ind w:left="567" w:hanging="357"/>
       </w:pPr>
       <w:r>
+        <w:lastRenderedPageBreak/>
         <w:t>requests (stand-alone testing)</w:t>
       </w:r>
     </w:p>
@@ -5543,7 +5552,6 @@
       </w:pPr>
       <w:proofErr w:type="spellStart"/>
       <w:r>
-        <w:lastRenderedPageBreak/>
         <w:t>wifi_service</w:t>
       </w:r>
       <w:proofErr w:type="spellEnd"/>

</xml_diff>